<commit_message>
cloud assignment question 2 done
</commit_message>
<xml_diff>
--- a/Cloud Basics Assignment.docx
+++ b/Cloud Basics Assignment.docx
@@ -1029,20 +1029,167 @@
       </w:r>
     </w:p>
     <w:p>
+      <w:proofErr w:type="gramStart"/>
       <w:r>
         <w:t xml:space="preserve">Name  </w:t>
       </w:r>
       <w:r>
-        <w:t>saharsh-aws-s3-bucket-private-portfolio</w:t>
-      </w:r>
-      <w:r>
-        <w:br/>
-      </w:r>
-      <w:r>
-        <w:br/>
-      </w:r>
+        <w:t>saharsh</w:t>
+      </w:r>
+      <w:proofErr w:type="gramEnd"/>
+      <w:r>
+        <w:t>-aws-s3-bucket-private-portfolio</w:t>
+      </w:r>
+      <w:r>
+        <w:br/>
+      </w:r>
+      <w:r>
+        <w:br/>
+      </w:r>
+      <w:r>
+        <w:br/>
+      </w:r>
+      <w:r>
+        <w:br/>
+      </w:r>
+      <w:r>
+        <w:drawing>
+          <wp:inline distT="0" distB="0" distL="0" distR="0" wp14:anchorId="65571B43" wp14:editId="6147ABD2">
+            <wp:extent cx="5943600" cy="2134235"/>
+            <wp:effectExtent l="0" t="0" r="0" b="0"/>
+            <wp:docPr id="654442015" name="Picture 1"/>
+            <wp:cNvGraphicFramePr>
+              <a:graphicFrameLocks xmlns:a="http://schemas.openxmlformats.org/drawingml/2006/main" noChangeAspect="1"/>
+            </wp:cNvGraphicFramePr>
+            <a:graphic xmlns:a="http://schemas.openxmlformats.org/drawingml/2006/main">
+              <a:graphicData uri="http://schemas.openxmlformats.org/drawingml/2006/picture">
+                <pic:pic xmlns:pic="http://schemas.openxmlformats.org/drawingml/2006/picture">
+                  <pic:nvPicPr>
+                    <pic:cNvPr id="654442015" name=""/>
+                    <pic:cNvPicPr/>
+                  </pic:nvPicPr>
+                  <pic:blipFill>
+                    <a:blip r:embed="rId16"/>
+                    <a:stretch>
+                      <a:fillRect/>
+                    </a:stretch>
+                  </pic:blipFill>
+                  <pic:spPr>
+                    <a:xfrm>
+                      <a:off x="0" y="0"/>
+                      <a:ext cx="5943600" cy="2134235"/>
+                    </a:xfrm>
+                    <a:prstGeom prst="rect">
+                      <a:avLst/>
+                    </a:prstGeom>
+                  </pic:spPr>
+                </pic:pic>
+              </a:graphicData>
+            </a:graphic>
+          </wp:inline>
+        </w:drawing>
+      </w:r>
+      <w:r>
+        <w:br/>
+      </w:r>
+    </w:p>
+    <w:p>
       <w:r>
         <w:t>hu-spark-26-saharsh-portfolio-endpoint</w:t>
+      </w:r>
+    </w:p>
+    <w:p>
+      <w:r>
+        <w:br/>
+      </w:r>
+      <w:r>
+        <w:drawing>
+          <wp:inline distT="0" distB="0" distL="0" distR="0" wp14:anchorId="3AFE1143" wp14:editId="7A1F039F">
+            <wp:extent cx="5943600" cy="2372360"/>
+            <wp:effectExtent l="0" t="0" r="0" b="8890"/>
+            <wp:docPr id="2021317826" name="Picture 1"/>
+            <wp:cNvGraphicFramePr>
+              <a:graphicFrameLocks xmlns:a="http://schemas.openxmlformats.org/drawingml/2006/main" noChangeAspect="1"/>
+            </wp:cNvGraphicFramePr>
+            <a:graphic xmlns:a="http://schemas.openxmlformats.org/drawingml/2006/main">
+              <a:graphicData uri="http://schemas.openxmlformats.org/drawingml/2006/picture">
+                <pic:pic xmlns:pic="http://schemas.openxmlformats.org/drawingml/2006/picture">
+                  <pic:nvPicPr>
+                    <pic:cNvPr id="2021317826" name=""/>
+                    <pic:cNvPicPr/>
+                  </pic:nvPicPr>
+                  <pic:blipFill>
+                    <a:blip r:embed="rId17"/>
+                    <a:stretch>
+                      <a:fillRect/>
+                    </a:stretch>
+                  </pic:blipFill>
+                  <pic:spPr>
+                    <a:xfrm>
+                      <a:off x="0" y="0"/>
+                      <a:ext cx="5943600" cy="2372360"/>
+                    </a:xfrm>
+                    <a:prstGeom prst="rect">
+                      <a:avLst/>
+                    </a:prstGeom>
+                  </pic:spPr>
+                </pic:pic>
+              </a:graphicData>
+            </a:graphic>
+          </wp:inline>
+        </w:drawing>
+      </w:r>
+      <w:r>
+        <w:br/>
+      </w:r>
+      <w:r>
+        <w:br/>
+      </w:r>
+    </w:p>
+    <w:p/>
+    <w:p>
+      <w:r>
+        <w:t>From outside the VPC (e.g. your own laptop, off the org network) attempt the same URL and confirm it is denied.</w:t>
+      </w:r>
+      <w:r>
+        <w:br/>
+      </w:r>
+      <w:r>
+        <w:drawing>
+          <wp:inline distT="0" distB="0" distL="0" distR="0" wp14:anchorId="6FA9707D" wp14:editId="6AE971D8">
+            <wp:extent cx="5943600" cy="1316355"/>
+            <wp:effectExtent l="0" t="0" r="0" b="0"/>
+            <wp:docPr id="2146629080" name="Picture 1"/>
+            <wp:cNvGraphicFramePr>
+              <a:graphicFrameLocks xmlns:a="http://schemas.openxmlformats.org/drawingml/2006/main" noChangeAspect="1"/>
+            </wp:cNvGraphicFramePr>
+            <a:graphic xmlns:a="http://schemas.openxmlformats.org/drawingml/2006/main">
+              <a:graphicData uri="http://schemas.openxmlformats.org/drawingml/2006/picture">
+                <pic:pic xmlns:pic="http://schemas.openxmlformats.org/drawingml/2006/picture">
+                  <pic:nvPicPr>
+                    <pic:cNvPr id="2146629080" name=""/>
+                    <pic:cNvPicPr/>
+                  </pic:nvPicPr>
+                  <pic:blipFill>
+                    <a:blip r:embed="rId18"/>
+                    <a:stretch>
+                      <a:fillRect/>
+                    </a:stretch>
+                  </pic:blipFill>
+                  <pic:spPr>
+                    <a:xfrm>
+                      <a:off x="0" y="0"/>
+                      <a:ext cx="5943600" cy="1316355"/>
+                    </a:xfrm>
+                    <a:prstGeom prst="rect">
+                      <a:avLst/>
+                    </a:prstGeom>
+                  </pic:spPr>
+                </pic:pic>
+              </a:graphicData>
+            </a:graphic>
+          </wp:inline>
+        </w:drawing>
       </w:r>
     </w:p>
     <w:sectPr>

</xml_diff>

<commit_message>
cloud assignment question 3 done
</commit_message>
<xml_diff>
--- a/Cloud Basics Assignment.docx
+++ b/Cloud Basics Assignment.docx
@@ -40,7 +40,6 @@
           <w:color w:val="000000" w:themeColor="text1"/>
         </w:rPr>
       </w:pPr>
-      <w:proofErr w:type="gramStart"/>
       <w:r>
         <w:rPr>
           <w:color w:val="000000" w:themeColor="text1"/>
@@ -51,35 +50,20 @@
         <w:rPr>
           <w:color w:val="000000" w:themeColor="text1"/>
         </w:rPr>
-        <w:t>Create</w:t>
-      </w:r>
-      <w:proofErr w:type="gramEnd"/>
-      <w:r>
-        <w:rPr>
-          <w:color w:val="000000" w:themeColor="text1"/>
-        </w:rPr>
-        <w:t xml:space="preserve"> a private subnet inside the pre-created VPC, using the CIDR</w:t>
-      </w:r>
-    </w:p>
-    <w:p>
-      <w:pPr>
-        <w:rPr>
-          <w:color w:val="000000" w:themeColor="text1"/>
-        </w:rPr>
-      </w:pPr>
-      <w:proofErr w:type="gramStart"/>
-      <w:r>
-        <w:rPr>
-          <w:color w:val="000000" w:themeColor="text1"/>
-        </w:rPr>
-        <w:t>Pre created</w:t>
-      </w:r>
-      <w:proofErr w:type="gramEnd"/>
-      <w:r>
-        <w:rPr>
-          <w:color w:val="000000" w:themeColor="text1"/>
-        </w:rPr>
-        <w:t xml:space="preserve"> VPC </w:t>
+        <w:t>Create a private subnet inside the pre-created VPC, using the CIDR</w:t>
+      </w:r>
+    </w:p>
+    <w:p>
+      <w:pPr>
+        <w:rPr>
+          <w:color w:val="000000" w:themeColor="text1"/>
+        </w:rPr>
+      </w:pPr>
+      <w:r>
+        <w:rPr>
+          <w:color w:val="000000" w:themeColor="text1"/>
+        </w:rPr>
+        <w:t xml:space="preserve">Pre created VPC </w:t>
       </w:r>
     </w:p>
     <w:p>
@@ -991,15 +975,7 @@
         </w:rPr>
       </w:pPr>
       <w:r>
-        <w:t xml:space="preserve">Design a small static site (a portfolio or landing </w:t>
-      </w:r>
-      <w:proofErr w:type="gramStart"/>
-      <w:r>
-        <w:t>page) —</w:t>
-      </w:r>
-      <w:proofErr w:type="gramEnd"/>
-      <w:r>
-        <w:t xml:space="preserve"> plain HTML/CSS, at least two pages or sections.</w:t>
+        <w:t>Design a small static site (a portfolio or landing page) — plain HTML/CSS, at least two pages or sections.</w:t>
       </w:r>
       <w:r>
         <w:rPr>
@@ -1029,16 +1005,11 @@
       </w:r>
     </w:p>
     <w:p>
-      <w:proofErr w:type="gramStart"/>
       <w:r>
         <w:t xml:space="preserve">Name  </w:t>
       </w:r>
       <w:r>
-        <w:t>saharsh</w:t>
-      </w:r>
-      <w:proofErr w:type="gramEnd"/>
-      <w:r>
-        <w:t>-aws-s3-bucket-private-portfolio</w:t>
+        <w:t>saharsh-aws-s3-bucket-private-portfolio</w:t>
       </w:r>
       <w:r>
         <w:br/>
@@ -1146,17 +1117,15 @@
         <w:br/>
       </w:r>
     </w:p>
-    <w:p/>
     <w:p>
       <w:r>
         <w:t>From outside the VPC (e.g. your own laptop, off the org network) attempt the same URL and confirm it is denied.</w:t>
       </w:r>
-      <w:r>
-        <w:br/>
-      </w:r>
+    </w:p>
+    <w:p>
       <w:r>
         <w:drawing>
-          <wp:inline distT="0" distB="0" distL="0" distR="0" wp14:anchorId="6FA9707D" wp14:editId="6AE971D8">
+          <wp:inline distT="0" distB="0" distL="0" distR="0" wp14:anchorId="60B7ADF7" wp14:editId="7F2F4BC0">
             <wp:extent cx="5943600" cy="1316355"/>
             <wp:effectExtent l="0" t="0" r="0" b="0"/>
             <wp:docPr id="2146629080" name="Picture 1"/>
@@ -1192,6 +1161,250 @@
         </w:drawing>
       </w:r>
     </w:p>
+    <w:p>
+      <w:r>
+        <w:lastRenderedPageBreak/>
+        <w:t xml:space="preserve">Question 3: </w:t>
+      </w:r>
+    </w:p>
+    <w:p/>
+    <w:p>
+      <w:r>
+        <w:t xml:space="preserve">Create a subnet inside the pre-created </w:t>
+      </w:r>
+      <w:proofErr w:type="spellStart"/>
+      <w:r>
+        <w:t>VNet</w:t>
+      </w:r>
+      <w:proofErr w:type="spellEnd"/>
+      <w:r>
+        <w:t xml:space="preserve"> that contains your reserved private IP.</w:t>
+      </w:r>
+      <w:r>
+        <w:br/>
+      </w:r>
+      <w:r>
+        <w:br/>
+      </w:r>
+      <w:r>
+        <w:t>hu-spark-26-saharsh-azure-subnet</w:t>
+      </w:r>
+      <w:r>
+        <w:br/>
+      </w:r>
+      <w:r>
+        <w:drawing>
+          <wp:inline distT="0" distB="0" distL="0" distR="0" wp14:anchorId="3118915B" wp14:editId="45F1CB6D">
+            <wp:extent cx="5943600" cy="3389630"/>
+            <wp:effectExtent l="0" t="0" r="0" b="1270"/>
+            <wp:docPr id="1695730163" name="Picture 1"/>
+            <wp:cNvGraphicFramePr>
+              <a:graphicFrameLocks xmlns:a="http://schemas.openxmlformats.org/drawingml/2006/main" noChangeAspect="1"/>
+            </wp:cNvGraphicFramePr>
+            <a:graphic xmlns:a="http://schemas.openxmlformats.org/drawingml/2006/main">
+              <a:graphicData uri="http://schemas.openxmlformats.org/drawingml/2006/picture">
+                <pic:pic xmlns:pic="http://schemas.openxmlformats.org/drawingml/2006/picture">
+                  <pic:nvPicPr>
+                    <pic:cNvPr id="1695730163" name=""/>
+                    <pic:cNvPicPr/>
+                  </pic:nvPicPr>
+                  <pic:blipFill>
+                    <a:blip r:embed="rId19"/>
+                    <a:stretch>
+                      <a:fillRect/>
+                    </a:stretch>
+                  </pic:blipFill>
+                  <pic:spPr>
+                    <a:xfrm>
+                      <a:off x="0" y="0"/>
+                      <a:ext cx="5943600" cy="3389630"/>
+                    </a:xfrm>
+                    <a:prstGeom prst="rect">
+                      <a:avLst/>
+                    </a:prstGeom>
+                  </pic:spPr>
+                </pic:pic>
+              </a:graphicData>
+            </a:graphic>
+          </wp:inline>
+        </w:drawing>
+      </w:r>
+      <w:r>
+        <w:br/>
+      </w:r>
+      <w:r>
+        <w:br/>
+      </w:r>
+      <w:r>
+        <w:t>Create a NAT Gateway resource and associate it with your subnet for outbound-only internet access (package installs). </w:t>
+      </w:r>
+      <w:r>
+        <w:br/>
+      </w:r>
+      <w:r>
+        <w:t>hu-spark-26-saharsh-azure-nat-gateway</w:t>
+      </w:r>
+      <w:r>
+        <w:br/>
+      </w:r>
+      <w:r>
+        <w:drawing>
+          <wp:inline distT="0" distB="0" distL="0" distR="0" wp14:anchorId="0772D653" wp14:editId="61AFDEB7">
+            <wp:extent cx="4665188" cy="3112674"/>
+            <wp:effectExtent l="0" t="0" r="2540" b="0"/>
+            <wp:docPr id="543442733" name="Picture 1"/>
+            <wp:cNvGraphicFramePr>
+              <a:graphicFrameLocks xmlns:a="http://schemas.openxmlformats.org/drawingml/2006/main" noChangeAspect="1"/>
+            </wp:cNvGraphicFramePr>
+            <a:graphic xmlns:a="http://schemas.openxmlformats.org/drawingml/2006/main">
+              <a:graphicData uri="http://schemas.openxmlformats.org/drawingml/2006/picture">
+                <pic:pic xmlns:pic="http://schemas.openxmlformats.org/drawingml/2006/picture">
+                  <pic:nvPicPr>
+                    <pic:cNvPr id="543442733" name=""/>
+                    <pic:cNvPicPr/>
+                  </pic:nvPicPr>
+                  <pic:blipFill>
+                    <a:blip r:embed="rId20"/>
+                    <a:stretch>
+                      <a:fillRect/>
+                    </a:stretch>
+                  </pic:blipFill>
+                  <pic:spPr>
+                    <a:xfrm>
+                      <a:off x="0" y="0"/>
+                      <a:ext cx="4710534" cy="3142929"/>
+                    </a:xfrm>
+                    <a:prstGeom prst="rect">
+                      <a:avLst/>
+                    </a:prstGeom>
+                  </pic:spPr>
+                </pic:pic>
+              </a:graphicData>
+            </a:graphic>
+          </wp:inline>
+        </w:drawing>
+      </w:r>
+    </w:p>
+    <w:p>
+      <w:r>
+        <w:lastRenderedPageBreak/>
+        <w:t xml:space="preserve">Create a Network Security Group: inbound HTTP (80) from the </w:t>
+      </w:r>
+      <w:proofErr w:type="spellStart"/>
+      <w:r>
+        <w:t>VNet</w:t>
+      </w:r>
+      <w:proofErr w:type="spellEnd"/>
+      <w:r>
+        <w:t xml:space="preserve"> address space only. No inbound SSH rule — management goes through Azure Bastion. </w:t>
+      </w:r>
+    </w:p>
+    <w:p>
+      <w:r>
+        <w:br/>
+      </w:r>
+      <w:r>
+        <w:t>hu-spark-26-saharsh-azure-outbound-rule</w:t>
+      </w:r>
+    </w:p>
+    <w:p>
+      <w:r>
+        <w:drawing>
+          <wp:inline distT="0" distB="0" distL="0" distR="0" wp14:anchorId="109794A3" wp14:editId="6D6CAC1D">
+            <wp:extent cx="5943600" cy="2708275"/>
+            <wp:effectExtent l="0" t="0" r="0" b="0"/>
+            <wp:docPr id="215078170" name="Picture 1"/>
+            <wp:cNvGraphicFramePr>
+              <a:graphicFrameLocks xmlns:a="http://schemas.openxmlformats.org/drawingml/2006/main" noChangeAspect="1"/>
+            </wp:cNvGraphicFramePr>
+            <a:graphic xmlns:a="http://schemas.openxmlformats.org/drawingml/2006/main">
+              <a:graphicData uri="http://schemas.openxmlformats.org/drawingml/2006/picture">
+                <pic:pic xmlns:pic="http://schemas.openxmlformats.org/drawingml/2006/picture">
+                  <pic:nvPicPr>
+                    <pic:cNvPr id="215078170" name=""/>
+                    <pic:cNvPicPr/>
+                  </pic:nvPicPr>
+                  <pic:blipFill>
+                    <a:blip r:embed="rId21"/>
+                    <a:stretch>
+                      <a:fillRect/>
+                    </a:stretch>
+                  </pic:blipFill>
+                  <pic:spPr>
+                    <a:xfrm>
+                      <a:off x="0" y="0"/>
+                      <a:ext cx="5943600" cy="2708275"/>
+                    </a:xfrm>
+                    <a:prstGeom prst="rect">
+                      <a:avLst/>
+                    </a:prstGeom>
+                  </pic:spPr>
+                </pic:pic>
+              </a:graphicData>
+            </a:graphic>
+          </wp:inline>
+        </w:drawing>
+      </w:r>
+    </w:p>
+    <w:p/>
+    <w:p>
+      <w:r>
+        <w:t xml:space="preserve">Deploy an Azure Bastion resource into the </w:t>
+      </w:r>
+      <w:proofErr w:type="spellStart"/>
+      <w:r>
+        <w:t>VNet's</w:t>
+      </w:r>
+      <w:proofErr w:type="spellEnd"/>
+      <w:r>
+        <w:t xml:space="preserve"> Bastion subnet to get browser-based SSH with no public IP anywhere. </w:t>
+      </w:r>
+    </w:p>
+    <w:p/>
+    <w:p>
+      <w:r>
+        <w:t>hu-spark-26-saharsh-azure-public-ip</w:t>
+      </w:r>
+      <w:r>
+        <w:br/>
+      </w:r>
+      <w:r>
+        <w:t>hu-spark-26-saharsh-azure-bastion</w:t>
+      </w:r>
+      <w:r>
+        <w:br/>
+      </w:r>
+      <w:r>
+        <w:br/>
+      </w:r>
+      <w:r>
+        <w:br/>
+      </w:r>
+      <w:r>
+        <w:br/>
+      </w:r>
+      <w:r>
+        <w:br/>
+      </w:r>
+      <w:r>
+        <w:br/>
+      </w:r>
+      <w:r>
+        <w:br/>
+      </w:r>
+      <w:r>
+        <w:t>Deploy a Linux (Ubuntu) VM with no public IP, explicitly assigning it the private IP address . </w:t>
+      </w:r>
+    </w:p>
+    <w:p/>
+    <w:p/>
+    <w:p/>
+    <w:p/>
+    <w:p/>
+    <w:p/>
+    <w:p/>
+    <w:p/>
+    <w:p/>
     <w:sectPr>
       <w:pgSz w:w="12240" w:h="15840"/>
       <w:pgMar w:top="1440" w:right="1440" w:bottom="1440" w:left="1440" w:header="720" w:footer="720" w:gutter="0"/>

</xml_diff>